<commit_message>
BSIT & TCMK 1 Done!
</commit_message>
<xml_diff>
--- a/Five/BSIT/Lab1/МихайличБСИТ_Лаб1.docx
+++ b/Five/BSIT/Lab1/МихайличБСИТ_Лаб1.docx
@@ -2478,11 +2478,84 @@
     <w:p>
       <w:pPr>
         <w:pStyle w:val="a"/>
+        <w:rPr>
+          <w:lang w:val="en-US"/>
+        </w:rPr>
       </w:pPr>
       <w:r>
         <w:t>Запрос информации от клиента</w:t>
       </w:r>
     </w:p>
+    <w:p>
+      <w:pPr>
+        <w:rPr>
+          <w:lang w:val="en-US"/>
+        </w:rPr>
+      </w:pPr>
+    </w:p>
+    <w:p>
+      <w:pPr>
+        <w:pStyle w:val="a8"/>
+        <w:rPr>
+          <w:lang w:val="en-US"/>
+        </w:rPr>
+      </w:pPr>
+      <w:r>
+        <w:rPr>
+          <w:lang w:val="en-US"/>
+        </w:rPr>
+        <w:lastRenderedPageBreak/>
+        <w:drawing>
+          <wp:inline distT="0" distB="0" distL="0" distR="0" wp14:anchorId="069D41DA" wp14:editId="3D2BD1FB">
+            <wp:extent cx="6300470" cy="3836035"/>
+            <wp:effectExtent l="0" t="0" r="0" b="0"/>
+            <wp:docPr id="1253528226" name="Picture 1"/>
+            <wp:cNvGraphicFramePr>
+              <a:graphicFrameLocks xmlns:a="http://schemas.openxmlformats.org/drawingml/2006/main" noChangeAspect="1"/>
+            </wp:cNvGraphicFramePr>
+            <a:graphic xmlns:a="http://schemas.openxmlformats.org/drawingml/2006/main">
+              <a:graphicData uri="http://schemas.openxmlformats.org/drawingml/2006/picture">
+                <pic:pic xmlns:pic="http://schemas.openxmlformats.org/drawingml/2006/picture">
+                  <pic:nvPicPr>
+                    <pic:cNvPr id="1253528226" name=""/>
+                    <pic:cNvPicPr/>
+                  </pic:nvPicPr>
+                  <pic:blipFill>
+                    <a:blip r:embed="rId14"/>
+                    <a:stretch>
+                      <a:fillRect/>
+                    </a:stretch>
+                  </pic:blipFill>
+                  <pic:spPr>
+                    <a:xfrm>
+                      <a:off x="0" y="0"/>
+                      <a:ext cx="6300470" cy="3836035"/>
+                    </a:xfrm>
+                    <a:prstGeom prst="rect">
+                      <a:avLst/>
+                    </a:prstGeom>
+                  </pic:spPr>
+                </pic:pic>
+              </a:graphicData>
+            </a:graphic>
+          </wp:inline>
+        </w:drawing>
+      </w:r>
+    </w:p>
+    <w:p>
+      <w:pPr>
+        <w:pStyle w:val="a"/>
+      </w:pPr>
+      <w:r>
+        <w:t xml:space="preserve">Передача сеансового ключа между клиентом и сервером, зашифрованного с помощью </w:t>
+      </w:r>
+      <w:r>
+        <w:rPr>
+          <w:lang w:val="en-US"/>
+        </w:rPr>
+        <w:t>EDCH</w:t>
+      </w:r>
+    </w:p>
     <w:p/>
     <w:p>
       <w:pPr>
@@ -2521,13 +2594,7 @@
     </w:p>
     <w:p>
       <w:pPr>
-        <w:rPr>
-          <w:rFonts w:eastAsia="Times New Roman"/>
-        </w:rPr>
-      </w:pPr>
-    </w:p>
-    <w:p>
-      <w:pPr>
+        <w:ind w:firstLine="0"/>
         <w:rPr>
           <w:rFonts w:eastAsia="Times New Roman"/>
           <w:lang w:val="en-US"/>
@@ -2538,184 +2605,770 @@
       <w:pPr>
         <w:rPr>
           <w:rFonts w:eastAsia="Times New Roman"/>
+          <w:lang w:val="en-US"/>
         </w:rPr>
       </w:pPr>
       <w:r>
         <w:rPr>
           <w:rFonts w:eastAsia="Times New Roman"/>
+          <w:lang w:val="en-US"/>
+        </w:rPr>
+        <w:t xml:space="preserve">typedef struct _ACL </w:t>
+      </w:r>
+    </w:p>
+    <w:p>
+      <w:pPr>
+        <w:rPr>
+          <w:rFonts w:eastAsia="Times New Roman"/>
+          <w:lang w:val="en-US"/>
+        </w:rPr>
+      </w:pPr>
+      <w:r>
+        <w:rPr>
+          <w:rFonts w:eastAsia="Times New Roman"/>
+          <w:lang w:val="en-US"/>
+        </w:rPr>
+        <w:t>{</w:t>
+      </w:r>
+    </w:p>
+    <w:p>
+      <w:pPr>
+        <w:ind w:left="708"/>
+        <w:rPr>
+          <w:rFonts w:eastAsia="Times New Roman"/>
+          <w:lang w:val="en-US"/>
+        </w:rPr>
+      </w:pPr>
+      <w:r>
+        <w:rPr>
+          <w:rFonts w:eastAsia="Times New Roman"/>
+          <w:lang w:val="en-US"/>
+        </w:rPr>
+        <w:t xml:space="preserve">BYTE </w:t>
+      </w:r>
+      <w:proofErr w:type="spellStart"/>
+      <w:r>
+        <w:rPr>
+          <w:rFonts w:eastAsia="Times New Roman"/>
+          <w:lang w:val="en-US"/>
+        </w:rPr>
+        <w:t>AclRevision</w:t>
+      </w:r>
+      <w:proofErr w:type="spellEnd"/>
+      <w:r>
+        <w:rPr>
+          <w:rFonts w:eastAsia="Times New Roman"/>
+          <w:lang w:val="en-US"/>
+        </w:rPr>
+        <w:t>;</w:t>
+      </w:r>
+    </w:p>
+    <w:p>
+      <w:pPr>
+        <w:ind w:left="708"/>
+        <w:rPr>
+          <w:rFonts w:eastAsia="Times New Roman"/>
+          <w:lang w:val="en-US"/>
+        </w:rPr>
+      </w:pPr>
+      <w:r>
+        <w:rPr>
+          <w:rFonts w:eastAsia="Times New Roman"/>
+          <w:lang w:val="en-US"/>
+        </w:rPr>
+        <w:t>BYTE Sbz1;</w:t>
+      </w:r>
+    </w:p>
+    <w:p>
+      <w:pPr>
+        <w:ind w:left="708"/>
+        <w:rPr>
+          <w:rFonts w:eastAsia="Times New Roman"/>
+          <w:lang w:val="en-US"/>
+        </w:rPr>
+      </w:pPr>
+      <w:r>
+        <w:rPr>
+          <w:rFonts w:eastAsia="Times New Roman"/>
+          <w:lang w:val="en-US"/>
+        </w:rPr>
+        <w:t xml:space="preserve">WORD </w:t>
+      </w:r>
+      <w:proofErr w:type="spellStart"/>
+      <w:r>
+        <w:rPr>
+          <w:rFonts w:eastAsia="Times New Roman"/>
+          <w:lang w:val="en-US"/>
+        </w:rPr>
+        <w:t>AclSize</w:t>
+      </w:r>
+      <w:proofErr w:type="spellEnd"/>
+      <w:r>
+        <w:rPr>
+          <w:rFonts w:eastAsia="Times New Roman"/>
+          <w:lang w:val="en-US"/>
+        </w:rPr>
+        <w:t>;</w:t>
+      </w:r>
+    </w:p>
+    <w:p>
+      <w:pPr>
+        <w:ind w:left="708"/>
+        <w:rPr>
+          <w:rFonts w:eastAsia="Times New Roman"/>
+          <w:lang w:val="en-US"/>
+        </w:rPr>
+      </w:pPr>
+      <w:r>
+        <w:rPr>
+          <w:rFonts w:eastAsia="Times New Roman"/>
+          <w:lang w:val="en-US"/>
+        </w:rPr>
+        <w:t xml:space="preserve">WORD </w:t>
+      </w:r>
+      <w:proofErr w:type="spellStart"/>
+      <w:r>
+        <w:rPr>
+          <w:rFonts w:eastAsia="Times New Roman"/>
+          <w:lang w:val="en-US"/>
+        </w:rPr>
+        <w:t>AceCount</w:t>
+      </w:r>
+      <w:proofErr w:type="spellEnd"/>
+      <w:r>
+        <w:rPr>
+          <w:rFonts w:eastAsia="Times New Roman"/>
+          <w:lang w:val="en-US"/>
+        </w:rPr>
+        <w:t>;</w:t>
+      </w:r>
+    </w:p>
+    <w:p>
+      <w:pPr>
+        <w:ind w:left="708"/>
+        <w:rPr>
+          <w:rFonts w:eastAsia="Times New Roman"/>
+          <w:lang w:val="en-US"/>
+        </w:rPr>
+      </w:pPr>
+      <w:r>
+        <w:rPr>
+          <w:rFonts w:eastAsia="Times New Roman"/>
+          <w:lang w:val="en-US"/>
         </w:rPr>
         <w:lastRenderedPageBreak/>
-        <w:t>typedef</w:t>
-      </w:r>
-      <w:r>
+        <w:t>WORD Sbz2;</w:t>
+      </w:r>
+    </w:p>
+    <w:p>
+      <w:pPr>
         <w:rPr>
           <w:rFonts w:eastAsia="Times New Roman"/>
-        </w:rPr>
+          <w:lang w:val="en-US"/>
+        </w:rPr>
+      </w:pPr>
+      <w:r>
+        <w:rPr>
+          <w:rFonts w:eastAsia="Times New Roman"/>
+          <w:lang w:val="en-US"/>
+        </w:rPr>
+        <w:t>} ACL;</w:t>
+      </w:r>
+    </w:p>
+    <w:p>
+      <w:pPr>
+        <w:rPr>
+          <w:lang w:val="en-US"/>
+        </w:rPr>
+      </w:pPr>
+    </w:p>
+    <w:p>
+      <w:pPr>
+        <w:rPr>
+          <w:rFonts w:eastAsia="Times New Roman"/>
+        </w:rPr>
+      </w:pPr>
+      <w:r>
+        <w:rPr>
+          <w:rFonts w:eastAsia="Times New Roman"/>
+        </w:rPr>
+        <w:t>Список управления доступом на уровне пользователей (DACL) определяет доверенные лица, которым разрешен или запрещен доступ к защищаемому объекту. Когда процесс пытается получить доступ к защищаемому объекту, система проверяет ACE в списке DACL объекта, чтобы определить, следует ли предоставить доступ к нему. Если у объекта нет DACL, система предоставляет полный доступ для всех. Если DACL объекта не имеет записей ACE, система отклоняет все попытки доступа к объекту, так как список DACL не разрешает права доступа. Система проверяет ACE по порядку, пока не обнаружит один или несколько записей ACE, которые разрешают все запрошенные права доступа, или пока не будут отклонены все запрошенные права доступа.</w:t>
+      </w:r>
+    </w:p>
+    <w:p>
+      <w:pPr>
+        <w:rPr>
+          <w:rFonts w:eastAsia="Times New Roman"/>
+        </w:rPr>
+      </w:pPr>
+      <w:r>
+        <w:rPr>
+          <w:rFonts w:eastAsia="Times New Roman"/>
+        </w:rPr>
+        <w:t>Системный список управления доступом (SACL) позволяет администраторам регистрировать попытки доступа к защищенному объекту.</w:t>
+      </w:r>
+    </w:p>
+    <w:p>
+      <w:pPr>
+        <w:rPr>
+          <w:rFonts w:eastAsia="Times New Roman"/>
+        </w:rPr>
+      </w:pPr>
+      <w:r>
+        <w:rPr>
+          <w:rFonts w:eastAsia="Times New Roman"/>
+        </w:rPr>
+        <w:t>Каждый элемент ACE указывает типы попыток доступа с помощью указанного доверенного лица, которое приводит к тому, что система создает запись в журнале событий безопасности. Элемент управления доступом в списке SACL может создавать записи аудита при неудачной попытке доступа, при успешном или в обоих случаях.</w:t>
+      </w:r>
+    </w:p>
+    <w:p>
+      <w:pPr>
+        <w:rPr>
+          <w:rFonts w:eastAsia="Times New Roman"/>
+        </w:rPr>
+      </w:pPr>
+    </w:p>
+    <w:p>
+      <w:pPr>
+        <w:pStyle w:val="a4"/>
+      </w:pPr>
+      <w:r>
+        <w:t>Что такое наследование прав доступа?</w:t>
+      </w:r>
+    </w:p>
+    <w:p>
+      <w:r>
+        <w:t>Наследование прав доступа в операционной системе Windows позволяет устанавливать и контролировать права доступа для файлов и папок на разных уровнях иерархии. Это позволяет обеспечить безопасность данных и контроль доступа различных пользователей или групп к определенным ресурсам.</w:t>
+      </w:r>
+    </w:p>
+    <w:p>
+      <w:r>
+        <w:t>Когда новый объект создается внутри существующей папки, он автоматически наследует права доступа от родительской папки. Это означает, что объект получает те же права доступа, что и родительская папка.</w:t>
+      </w:r>
+    </w:p>
+    <w:p/>
+    <w:p>
+      <w:pPr>
+        <w:pStyle w:val="a4"/>
+      </w:pPr>
+      <w:r>
+        <w:lastRenderedPageBreak/>
+        <w:t xml:space="preserve">Для чего используется </w:t>
+      </w:r>
+      <w:r>
+        <w:rPr>
+          <w:lang w:val="en-US"/>
+        </w:rPr>
+        <w:t>well</w:t>
+      </w:r>
+      <w:r>
+        <w:t>-</w:t>
+      </w:r>
+      <w:r>
+        <w:rPr>
+          <w:lang w:val="en-US"/>
+        </w:rPr>
+        <w:t>known</w:t>
+      </w:r>
+      <w:r>
         <w:t xml:space="preserve"> </w:t>
       </w:r>
       <w:r>
         <w:rPr>
+          <w:lang w:val="en-US"/>
+        </w:rPr>
+        <w:t>SID</w:t>
+      </w:r>
+      <w:r>
+        <w:t>?</w:t>
+      </w:r>
+    </w:p>
+    <w:p>
+      <w:pPr>
+        <w:rPr>
           <w:rFonts w:eastAsia="Times New Roman"/>
         </w:rPr>
-        <w:t>struct</w:t>
-      </w:r>
+      </w:pPr>
       <w:r>
         <w:rPr>
           <w:rFonts w:eastAsia="Times New Roman"/>
         </w:rPr>
-        <w:t xml:space="preserve"> _</w:t>
+        <w:t>Well-known SIDs используются для идентификации общих групп и общих пользователей. Например, существуют</w:t>
       </w:r>
       <w:r>
         <w:rPr>
           <w:rFonts w:eastAsia="Times New Roman"/>
-        </w:rPr>
-        <w:t>ACL</w:t>
+          <w:lang w:val="en-US"/>
+        </w:rPr>
+        <w:t xml:space="preserve"> </w:t>
       </w:r>
       <w:r>
         <w:rPr>
           <w:rFonts w:eastAsia="Times New Roman"/>
         </w:rPr>
+        <w:t>идентификации следующих общих групп и пользователей:</w:t>
+      </w:r>
+    </w:p>
+    <w:p>
+      <w:pPr>
+        <w:pStyle w:val="a1"/>
+        <w:rPr>
+          <w:rFonts w:eastAsia="Times New Roman"/>
+        </w:rPr>
+      </w:pPr>
+      <w:r>
+        <w:rPr>
+          <w:rFonts w:eastAsia="Times New Roman"/>
+        </w:rPr>
+        <w:t>«Каждый пользователь» или «Мир» - группа, в которую входят все пользователи.</w:t>
+      </w:r>
+    </w:p>
+    <w:p>
+      <w:pPr>
+        <w:pStyle w:val="a1"/>
+        <w:rPr>
+          <w:rFonts w:eastAsia="Times New Roman"/>
+        </w:rPr>
+      </w:pPr>
+      <w:r>
+        <w:rPr>
+          <w:rFonts w:eastAsia="Times New Roman"/>
+        </w:rPr>
+        <w:t>CREATOR_OWNER, - пользователь, который используется в качестве владельца в наследуемой записи ACE (Когда запись ACE наследуется, система заменяет CREATOR_OWNER SID на SID создателя объекта)</w:t>
+      </w:r>
+    </w:p>
+    <w:p>
+      <w:pPr>
+        <w:pStyle w:val="a1"/>
+        <w:rPr>
+          <w:rFonts w:eastAsia="Times New Roman"/>
+        </w:rPr>
+      </w:pPr>
+      <w:r>
+        <w:rPr>
+          <w:rFonts w:eastAsia="Times New Roman"/>
+        </w:rPr>
+        <w:t>Группа «Администраторы» для встроенного домена на локальном</w:t>
+      </w:r>
+    </w:p>
+    <w:p>
+      <w:pPr>
+        <w:rPr>
+          <w:rFonts w:eastAsia="Times New Roman"/>
+        </w:rPr>
+      </w:pPr>
+      <w:r>
+        <w:rPr>
+          <w:rFonts w:eastAsia="Times New Roman"/>
+        </w:rPr>
+        <w:t>компьютере.</w:t>
+      </w:r>
+    </w:p>
+    <w:p>
+      <w:pPr>
+        <w:rPr>
+          <w:lang w:val="en-US"/>
+        </w:rPr>
+      </w:pPr>
+    </w:p>
+    <w:p>
+      <w:pPr>
+        <w:pStyle w:val="a4"/>
+      </w:pPr>
+      <w:r>
+        <w:t xml:space="preserve">Как выглядит схема шифрования с использованием сеансового ключа? </w:t>
+      </w:r>
+    </w:p>
+    <w:p>
+      <w:r>
+        <w:t xml:space="preserve">В математическом примере обе стороны публично договариваются о числах </w:t>
+      </w:r>
+      <w:r>
+        <w:rPr>
+          <w:lang w:val="en-US"/>
+        </w:rPr>
+        <w:t>p</w:t>
+      </w:r>
+      <w:r>
+        <w:t xml:space="preserve">, </w:t>
+      </w:r>
+      <w:r>
+        <w:rPr>
+          <w:lang w:val="en-US"/>
+        </w:rPr>
+        <w:t>q</w:t>
+      </w:r>
+      <w:r>
+        <w:t xml:space="preserve"> (</w:t>
+      </w:r>
+      <w:r>
+        <w:t>зачастую достаточно большие простые числа). Затем схема получения общего числа (сеансового ключа) выглядит так:</w:t>
+      </w:r>
+    </w:p>
+    <w:p>
+      <w:pPr>
+        <w:pStyle w:val="a4"/>
+        <w:numPr>
+          <w:ilvl w:val="0"/>
+          <w:numId w:val="27"/>
+        </w:numPr>
+      </w:pPr>
+      <w:r>
+        <w:t xml:space="preserve">Обе стороны выбирают свои закрытые числа </w:t>
+      </w:r>
+      <w:r>
+        <w:rPr>
+          <w:lang w:val="en-US"/>
+        </w:rPr>
+        <w:t>a</w:t>
+      </w:r>
+      <w:r>
+        <w:t xml:space="preserve">, </w:t>
+      </w:r>
+      <w:r>
+        <w:rPr>
+          <w:lang w:val="en-US"/>
+        </w:rPr>
+        <w:t>b</w:t>
+      </w:r>
+      <w:r>
+        <w:t xml:space="preserve">, </w:t>
+      </w:r>
+      <w:r>
+        <w:t>которые остаются секретными</w:t>
+      </w:r>
+    </w:p>
+    <w:p>
+      <w:pPr>
+        <w:pStyle w:val="a4"/>
+        <w:numPr>
+          <w:ilvl w:val="0"/>
+          <w:numId w:val="27"/>
+        </w:numPr>
+      </w:pPr>
+      <w:r>
+        <w:t xml:space="preserve">Затем стороны выполняют следующие действия: </w:t>
+      </w:r>
+      <w:r>
+        <w:rPr>
+          <w:lang w:val="en-US"/>
+        </w:rPr>
+        <w:t>A</w:t>
+      </w:r>
+      <w:r>
+        <w:t xml:space="preserve"> = </w:t>
+      </w:r>
+      <w:r>
+        <w:rPr>
+          <w:lang w:val="en-US"/>
+        </w:rPr>
+        <w:t>p</w:t>
+      </w:r>
+      <w:r>
+        <w:rPr>
+          <w:vertAlign w:val="superscript"/>
+          <w:lang w:val="en-US"/>
+        </w:rPr>
+        <w:t>a</w:t>
+      </w:r>
+      <w:r>
         <w:t xml:space="preserve"> </w:t>
       </w:r>
-    </w:p>
-    <w:p>
-      <w:pPr>
+      <w:r>
+        <w:rPr>
+          <w:lang w:val="en-US"/>
+        </w:rPr>
+        <w:t>mod</w:t>
+      </w:r>
+      <w:r>
+        <w:t xml:space="preserve"> </w:t>
+      </w:r>
+      <w:r>
+        <w:rPr>
+          <w:lang w:val="en-US"/>
+        </w:rPr>
+        <w:t>q</w:t>
+      </w:r>
+      <w:r>
+        <w:t xml:space="preserve">; </w:t>
+      </w:r>
+      <w:r>
+        <w:rPr>
+          <w:lang w:val="en-US"/>
+        </w:rPr>
+        <w:t>B</w:t>
+      </w:r>
+      <w:r>
+        <w:t xml:space="preserve"> = </w:t>
+      </w:r>
+      <w:r>
+        <w:rPr>
+          <w:lang w:val="en-US"/>
+        </w:rPr>
+        <w:t>p</w:t>
+      </w:r>
+      <w:r>
+        <w:rPr>
+          <w:vertAlign w:val="superscript"/>
+          <w:lang w:val="en-US"/>
+        </w:rPr>
+        <w:t>b</w:t>
+      </w:r>
+      <w:r>
+        <w:t xml:space="preserve"> </w:t>
+      </w:r>
+      <w:r>
+        <w:rPr>
+          <w:lang w:val="en-US"/>
+        </w:rPr>
+        <w:t>mod</w:t>
+      </w:r>
+      <w:r>
+        <w:t xml:space="preserve"> </w:t>
+      </w:r>
+      <w:r>
+        <w:rPr>
+          <w:lang w:val="en-US"/>
+        </w:rPr>
+        <w:t>q</w:t>
+      </w:r>
+      <w:r>
+        <w:t>;</w:t>
+      </w:r>
+    </w:p>
+    <w:p>
+      <w:pPr>
+        <w:pStyle w:val="a4"/>
+        <w:numPr>
+          <w:ilvl w:val="0"/>
+          <w:numId w:val="27"/>
+        </w:numPr>
+      </w:pPr>
+      <w:r>
+        <w:t xml:space="preserve">Стороны публично обмениваются числами </w:t>
+      </w:r>
+      <w:r>
+        <w:rPr>
+          <w:lang w:val="en-US"/>
+        </w:rPr>
+        <w:t>A</w:t>
+      </w:r>
+      <w:r>
+        <w:t xml:space="preserve">, </w:t>
+      </w:r>
+      <w:r>
+        <w:rPr>
+          <w:lang w:val="en-US"/>
+        </w:rPr>
+        <w:t>B</w:t>
+      </w:r>
+    </w:p>
+    <w:p>
+      <w:pPr>
+        <w:pStyle w:val="a4"/>
+        <w:numPr>
+          <w:ilvl w:val="0"/>
+          <w:numId w:val="27"/>
+        </w:numPr>
+      </w:pPr>
+      <w:r>
+        <w:t xml:space="preserve">Затем стороны возводят полученные числа в степень своего закрытого числа: </w:t>
+      </w:r>
+      <w:r>
+        <w:rPr>
+          <w:lang w:val="en-US"/>
+        </w:rPr>
+        <w:t>K</w:t>
+      </w:r>
+      <w:r>
+        <w:rPr>
+          <w:vertAlign w:val="subscript"/>
+        </w:rPr>
+        <w:t>1</w:t>
+      </w:r>
+      <w:r>
+        <w:t xml:space="preserve"> = </w:t>
+      </w:r>
+      <w:r>
+        <w:rPr>
+          <w:lang w:val="en-US"/>
+        </w:rPr>
+        <w:t>A</w:t>
+      </w:r>
+      <w:r>
+        <w:rPr>
+          <w:vertAlign w:val="superscript"/>
+          <w:lang w:val="en-US"/>
+        </w:rPr>
+        <w:t>b</w:t>
+      </w:r>
+      <w:r>
+        <w:t xml:space="preserve"> </w:t>
+      </w:r>
+      <w:r>
+        <w:rPr>
+          <w:lang w:val="en-US"/>
+        </w:rPr>
+        <w:t>mod</w:t>
+      </w:r>
+      <w:r>
+        <w:t xml:space="preserve"> </w:t>
+      </w:r>
+      <w:r>
+        <w:rPr>
+          <w:lang w:val="en-US"/>
+        </w:rPr>
+        <w:t>q</w:t>
+      </w:r>
+      <w:r>
+        <w:t xml:space="preserve">; </w:t>
+      </w:r>
+      <w:r>
+        <w:rPr>
+          <w:lang w:val="en-US"/>
+        </w:rPr>
+        <w:t>K</w:t>
+      </w:r>
+      <w:r>
+        <w:rPr>
+          <w:vertAlign w:val="subscript"/>
+        </w:rPr>
+        <w:t>2</w:t>
+      </w:r>
+      <w:r>
+        <w:t xml:space="preserve"> = </w:t>
+      </w:r>
+      <w:r>
+        <w:rPr>
+          <w:lang w:val="en-US"/>
+        </w:rPr>
+        <w:t>B</w:t>
+      </w:r>
+      <w:r>
+        <w:rPr>
+          <w:vertAlign w:val="superscript"/>
+          <w:lang w:val="en-US"/>
+        </w:rPr>
+        <w:t>a</w:t>
+      </w:r>
+      <w:r>
+        <w:t xml:space="preserve"> </w:t>
+      </w:r>
+      <w:r>
+        <w:rPr>
+          <w:lang w:val="en-US"/>
+        </w:rPr>
+        <w:t>mod</w:t>
+      </w:r>
+      <w:r>
+        <w:t xml:space="preserve"> </w:t>
+      </w:r>
+      <w:r>
+        <w:rPr>
+          <w:lang w:val="en-US"/>
+        </w:rPr>
+        <w:t>q</w:t>
+      </w:r>
+      <w:r>
+        <w:t xml:space="preserve">; </w:t>
+      </w:r>
+      <w:r>
+        <w:t xml:space="preserve">Тем самым стороны получают общее число, которое не было передано публично, т. к. </w:t>
+      </w:r>
+      <w:r>
+        <w:rPr>
+          <w:lang w:val="en-US"/>
+        </w:rPr>
+        <w:t>K</w:t>
+      </w:r>
+      <w:r>
+        <w:rPr>
+          <w:vertAlign w:val="subscript"/>
+        </w:rPr>
+        <w:t>1</w:t>
+      </w:r>
+      <w:r>
+        <w:t xml:space="preserve"> = </w:t>
+      </w:r>
+      <w:r>
+        <w:rPr>
+          <w:lang w:val="en-US"/>
+        </w:rPr>
+        <w:t>K</w:t>
+      </w:r>
+      <w:r>
+        <w:rPr>
+          <w:vertAlign w:val="subscript"/>
+        </w:rPr>
+        <w:t>2</w:t>
+      </w:r>
+    </w:p>
+    <w:p>
+      <w:r>
+        <w:t xml:space="preserve">Генерация и передача сеансового ключа происходит во время каждого соединения клиента и сервера. Затем стороны могут использовать симметричное шифрование (например с использованием </w:t>
+      </w:r>
+      <w:proofErr w:type="spellStart"/>
+      <w:r>
+        <w:rPr>
+          <w:lang w:val="en-US"/>
+        </w:rPr>
+        <w:t>xor</w:t>
+      </w:r>
+      <w:proofErr w:type="spellEnd"/>
+      <w:r>
+        <w:t xml:space="preserve"> </w:t>
+      </w:r>
+      <w:r>
+        <w:t xml:space="preserve">с байтами данных и байтами ключа). Одна из особенностей сеансового ключа состоит в том, что он </w:t>
+      </w:r>
+      <w:r>
+        <w:lastRenderedPageBreak/>
+        <w:t>используется в шифровании в течение одной сессии, а каждые последующие сессии будут шифроваться уже с другим ключом, сгенерированным в начале.</w:t>
+      </w:r>
+    </w:p>
+    <w:p/>
+    <w:p>
+      <w:pPr>
+        <w:pStyle w:val="a4"/>
+      </w:pPr>
+      <w:r>
+        <w:t>В чем преимущества использования сеансового ключа?</w:t>
+      </w:r>
+    </w:p>
+    <w:p>
+      <w:r>
+        <w:t>Сеансовый ключ позволяет защититься от повторного использования злоумышленником перехваченных потоков данных, а также конкретный сеансовый ключ будет актуальным непродолжительное количество времени.</w:t>
+      </w:r>
+    </w:p>
+    <w:p>
+      <w:pPr>
+        <w:pStyle w:val="a4"/>
+        <w:numPr>
+          <w:ilvl w:val="0"/>
+          <w:numId w:val="0"/>
+        </w:numPr>
+        <w:ind w:left="851"/>
+      </w:pPr>
+    </w:p>
+    <w:p/>
+    <w:p>
+      <w:pPr>
+        <w:pStyle w:val="a9"/>
+      </w:pPr>
+      <w:r>
+        <w:t>Вывод</w:t>
+      </w:r>
+    </w:p>
+    <w:p>
+      <w:r>
         <w:rPr>
           <w:rFonts w:eastAsia="Times New Roman"/>
         </w:rPr>
-      </w:pPr>
-      <w:r>
-        <w:rPr>
-          <w:rFonts w:eastAsia="Times New Roman"/>
-        </w:rPr>
-        <w:t>{</w:t>
-      </w:r>
-    </w:p>
-    <w:p>
-      <w:pPr>
-        <w:rPr>
-          <w:rFonts w:eastAsia="Times New Roman"/>
-        </w:rPr>
-      </w:pPr>
-      <w:r>
-        <w:rPr>
-          <w:rFonts w:eastAsia="Times New Roman"/>
-        </w:rPr>
-        <w:t>BYTE AclRevision;</w:t>
-      </w:r>
-    </w:p>
-    <w:p>
-      <w:pPr>
-        <w:rPr>
-          <w:rFonts w:eastAsia="Times New Roman"/>
-        </w:rPr>
-      </w:pPr>
-      <w:r>
-        <w:rPr>
-          <w:rFonts w:eastAsia="Times New Roman"/>
-        </w:rPr>
-        <w:t>BYTE Sbz1;</w:t>
-      </w:r>
-    </w:p>
-    <w:p>
-      <w:pPr>
-        <w:rPr>
-          <w:rFonts w:eastAsia="Times New Roman"/>
-        </w:rPr>
-      </w:pPr>
-      <w:r>
-        <w:rPr>
-          <w:rFonts w:eastAsia="Times New Roman"/>
-        </w:rPr>
-        <w:t xml:space="preserve">WORD </w:t>
-      </w:r>
-      <w:proofErr w:type="spellStart"/>
-      <w:r>
-        <w:rPr>
-          <w:rFonts w:eastAsia="Times New Roman"/>
-        </w:rPr>
-        <w:t>AclSize</w:t>
-      </w:r>
-      <w:proofErr w:type="spellEnd"/>
-      <w:r>
-        <w:rPr>
-          <w:rFonts w:eastAsia="Times New Roman"/>
-        </w:rPr>
-        <w:t>;</w:t>
-      </w:r>
-    </w:p>
-    <w:p>
-      <w:pPr>
-        <w:rPr>
-          <w:rFonts w:eastAsia="Times New Roman"/>
-        </w:rPr>
-      </w:pPr>
-      <w:r>
-        <w:rPr>
-          <w:rFonts w:eastAsia="Times New Roman"/>
-        </w:rPr>
-        <w:t xml:space="preserve">WORD </w:t>
-      </w:r>
-      <w:proofErr w:type="spellStart"/>
-      <w:r>
-        <w:rPr>
-          <w:rFonts w:eastAsia="Times New Roman"/>
-        </w:rPr>
-        <w:t>AceCount</w:t>
-      </w:r>
-      <w:proofErr w:type="spellEnd"/>
-      <w:r>
-        <w:rPr>
-          <w:rFonts w:eastAsia="Times New Roman"/>
-        </w:rPr>
-        <w:t>;</w:t>
-      </w:r>
-    </w:p>
-    <w:p>
-      <w:pPr>
-        <w:rPr>
-          <w:rFonts w:eastAsia="Times New Roman"/>
-        </w:rPr>
-      </w:pPr>
-      <w:r>
-        <w:rPr>
-          <w:rFonts w:eastAsia="Times New Roman"/>
-        </w:rPr>
-        <w:t>WORD Sbz2;</w:t>
-      </w:r>
-    </w:p>
-    <w:p>
-      <w:pPr>
-        <w:rPr>
-          <w:rFonts w:eastAsia="Times New Roman"/>
-        </w:rPr>
-      </w:pPr>
-      <w:r>
-        <w:rPr>
-          <w:rFonts w:eastAsia="Times New Roman"/>
-        </w:rPr>
-        <w:t>} ACL;</w:t>
-      </w:r>
-    </w:p>
-    <w:p>
-      <w:pPr>
-        <w:rPr>
-          <w:lang w:val="en-US"/>
-        </w:rPr>
-      </w:pPr>
-    </w:p>
-    <w:p>
-      <w:pPr>
-        <w:spacing w:line="240" w:lineRule="auto"/>
-        <w:ind w:firstLine="0"/>
-        <w:rPr>
-          <w:lang w:val="en-US"/>
-        </w:rPr>
-      </w:pPr>
-      <w:r>
-        <w:rPr>
-          <w:lang w:val="en-US"/>
-        </w:rPr>
+        <w:t>В ходе данной лабораторной работы были получены навыки организации параллельной обработки большого количества клиентских соединений при помощи механизма портов завершения Win32. Получены навыки реализации шифрования передаваемых данных при помощи средств CryptoAPI. Получены навыки извлечения информации о системе. Была разработана распределенная система сбора информации о компьютере, состоящая из сервера и клиента, взаимодействующих через сокеты.</w:t>
+      </w:r>
+    </w:p>
+    <w:p>
+      <w:r>
         <w:br w:type="page"/>
       </w:r>
     </w:p>
@@ -10425,15 +11078,7 @@
       </w:r>
       <w:proofErr w:type="spellEnd"/>
       <w:r>
-        <w:t>, &amp;</w:t>
-      </w:r>
-      <w:proofErr w:type="spellStart"/>
-      <w:r>
-        <w:t>sidType</w:t>
-      </w:r>
-      <w:proofErr w:type="spellEnd"/>
-      <w:r>
-        <w:t>))</w:t>
+        <w:t>, &amp;sidType))</w:t>
       </w:r>
     </w:p>
     <w:p>
@@ -11797,15 +12442,7 @@
       </w:r>
       <w:proofErr w:type="spellEnd"/>
       <w:r>
-        <w:t xml:space="preserve"> </w:t>
-      </w:r>
-      <w:proofErr w:type="spellStart"/>
-      <w:r>
-        <w:t>os</w:t>
-      </w:r>
-      <w:proofErr w:type="spellEnd"/>
-      <w:r>
-        <w:t xml:space="preserve"> = </w:t>
+        <w:t xml:space="preserve"> os = </w:t>
       </w:r>
       <w:proofErr w:type="spellStart"/>
       <w:proofErr w:type="gramStart"/>
@@ -18924,15 +19561,7 @@
       </w:r>
       <w:proofErr w:type="spellEnd"/>
       <w:r>
-        <w:t xml:space="preserve"> </w:t>
-      </w:r>
-      <w:proofErr w:type="spellStart"/>
-      <w:r>
-        <w:t>systemStart</w:t>
-      </w:r>
-      <w:proofErr w:type="spellEnd"/>
-      <w:r>
-        <w:t xml:space="preserve"> = </w:t>
+        <w:t xml:space="preserve"> systemStart = </w:t>
       </w:r>
       <w:proofErr w:type="spellStart"/>
       <w:proofErr w:type="gramStart"/>
@@ -24380,14 +25009,9 @@
       <w:r>
         <w:t xml:space="preserve"> </w:t>
       </w:r>
-      <w:proofErr w:type="spellStart"/>
-      <w:proofErr w:type="gramStart"/>
-      <w:r>
-        <w:t>clientAddress</w:t>
-      </w:r>
-      <w:proofErr w:type="spellEnd"/>
-      <w:r>
-        <w:t>{</w:t>
+      <w:proofErr w:type="gramStart"/>
+      <w:r>
+        <w:t>clientAddress{</w:t>
       </w:r>
       <w:proofErr w:type="gramEnd"/>
       <w:r>
@@ -30803,15 +31427,7 @@
       </w:r>
       <w:proofErr w:type="gramEnd"/>
       <w:r>
-        <w:t xml:space="preserve">), size, </w:t>
-      </w:r>
-      <w:proofErr w:type="spellStart"/>
-      <w:r>
-        <w:t>nullptr</w:t>
-      </w:r>
-      <w:proofErr w:type="spellEnd"/>
-      <w:r>
-        <w:t>,</w:t>
+        <w:t>), size, nullptr,</w:t>
       </w:r>
     </w:p>
     <w:p>
@@ -42713,12 +43329,12 @@
       </w:pPr>
     </w:p>
     <w:sectPr>
-      <w:headerReference w:type="even" r:id="rId14"/>
-      <w:headerReference w:type="default" r:id="rId15"/>
-      <w:footerReference w:type="even" r:id="rId16"/>
-      <w:footerReference w:type="default" r:id="rId17"/>
-      <w:headerReference w:type="first" r:id="rId18"/>
-      <w:footerReference w:type="first" r:id="rId19"/>
+      <w:headerReference w:type="even" r:id="rId15"/>
+      <w:headerReference w:type="default" r:id="rId16"/>
+      <w:footerReference w:type="even" r:id="rId17"/>
+      <w:footerReference w:type="default" r:id="rId18"/>
+      <w:headerReference w:type="first" r:id="rId19"/>
+      <w:footerReference w:type="first" r:id="rId20"/>
       <w:pgSz w:w="11906" w:h="16838"/>
       <w:pgMar w:top="1134" w:right="850" w:bottom="1134" w:left="1134" w:header="708" w:footer="708" w:gutter="0"/>
       <w:cols w:space="708"/>
@@ -44816,8 +45432,8 @@
   <w:abstractNum w:abstractNumId="20" w15:restartNumberingAfterBreak="0">
     <w:nsid w:val="5D123824"/>
     <w:multiLevelType w:val="hybridMultilevel"/>
-    <w:tmpl w:val="D9EAA19A"/>
-    <w:lvl w:ilvl="0" w:tplc="25F0B318">
+    <w:tmpl w:val="693C9558"/>
+    <w:lvl w:ilvl="0" w:tplc="FD66FBD8">
       <w:start w:val="1"/>
       <w:numFmt w:val="decimal"/>
       <w:pStyle w:val="a4"/>
@@ -45603,6 +46219,12 @@
   </w:num>
   <w:num w:numId="26" w16cid:durableId="1095394114">
     <w:abstractNumId w:val="15"/>
+  </w:num>
+  <w:num w:numId="27" w16cid:durableId="1668901682">
+    <w:abstractNumId w:val="20"/>
+    <w:lvlOverride w:ilvl="0">
+      <w:startOverride w:val="1"/>
+    </w:lvlOverride>
   </w:num>
   <w:numIdMacAtCleanup w:val="12"/>
 </w:numbering>

</xml_diff>

<commit_message>
Rev 1 lab prepare
</commit_message>
<xml_diff>
--- a/Five/BSIT/Lab1/МихайличБСИТ_Лаб1.docx
+++ b/Five/BSIT/Lab1/МихайличБСИТ_Лаб1.docx
@@ -2478,11 +2478,84 @@
     <w:p>
       <w:pPr>
         <w:pStyle w:val="a"/>
+        <w:rPr>
+          <w:lang w:val="en-US"/>
+        </w:rPr>
       </w:pPr>
       <w:r>
         <w:t>Запрос информации от клиента</w:t>
       </w:r>
     </w:p>
+    <w:p>
+      <w:pPr>
+        <w:rPr>
+          <w:lang w:val="en-US"/>
+        </w:rPr>
+      </w:pPr>
+    </w:p>
+    <w:p>
+      <w:pPr>
+        <w:pStyle w:val="a8"/>
+        <w:rPr>
+          <w:lang w:val="en-US"/>
+        </w:rPr>
+      </w:pPr>
+      <w:r>
+        <w:rPr>
+          <w:lang w:val="en-US"/>
+        </w:rPr>
+        <w:lastRenderedPageBreak/>
+        <w:drawing>
+          <wp:inline distT="0" distB="0" distL="0" distR="0" wp14:anchorId="069D41DA" wp14:editId="3D2BD1FB">
+            <wp:extent cx="6300470" cy="3836035"/>
+            <wp:effectExtent l="0" t="0" r="0" b="0"/>
+            <wp:docPr id="1253528226" name="Picture 1"/>
+            <wp:cNvGraphicFramePr>
+              <a:graphicFrameLocks xmlns:a="http://schemas.openxmlformats.org/drawingml/2006/main" noChangeAspect="1"/>
+            </wp:cNvGraphicFramePr>
+            <a:graphic xmlns:a="http://schemas.openxmlformats.org/drawingml/2006/main">
+              <a:graphicData uri="http://schemas.openxmlformats.org/drawingml/2006/picture">
+                <pic:pic xmlns:pic="http://schemas.openxmlformats.org/drawingml/2006/picture">
+                  <pic:nvPicPr>
+                    <pic:cNvPr id="1253528226" name=""/>
+                    <pic:cNvPicPr/>
+                  </pic:nvPicPr>
+                  <pic:blipFill>
+                    <a:blip r:embed="rId14"/>
+                    <a:stretch>
+                      <a:fillRect/>
+                    </a:stretch>
+                  </pic:blipFill>
+                  <pic:spPr>
+                    <a:xfrm>
+                      <a:off x="0" y="0"/>
+                      <a:ext cx="6300470" cy="3836035"/>
+                    </a:xfrm>
+                    <a:prstGeom prst="rect">
+                      <a:avLst/>
+                    </a:prstGeom>
+                  </pic:spPr>
+                </pic:pic>
+              </a:graphicData>
+            </a:graphic>
+          </wp:inline>
+        </w:drawing>
+      </w:r>
+    </w:p>
+    <w:p>
+      <w:pPr>
+        <w:pStyle w:val="a"/>
+      </w:pPr>
+      <w:r>
+        <w:t xml:space="preserve">Передача сеансового ключа между клиентом и сервером, зашифрованного с помощью </w:t>
+      </w:r>
+      <w:r>
+        <w:rPr>
+          <w:lang w:val="en-US"/>
+        </w:rPr>
+        <w:t>EDCH</w:t>
+      </w:r>
+    </w:p>
     <w:p/>
     <w:p>
       <w:pPr>
@@ -2521,13 +2594,7 @@
     </w:p>
     <w:p>
       <w:pPr>
-        <w:rPr>
-          <w:rFonts w:eastAsia="Times New Roman"/>
-        </w:rPr>
-      </w:pPr>
-    </w:p>
-    <w:p>
-      <w:pPr>
+        <w:ind w:firstLine="0"/>
         <w:rPr>
           <w:rFonts w:eastAsia="Times New Roman"/>
           <w:lang w:val="en-US"/>
@@ -2538,184 +2605,770 @@
       <w:pPr>
         <w:rPr>
           <w:rFonts w:eastAsia="Times New Roman"/>
+          <w:lang w:val="en-US"/>
         </w:rPr>
       </w:pPr>
       <w:r>
         <w:rPr>
           <w:rFonts w:eastAsia="Times New Roman"/>
+          <w:lang w:val="en-US"/>
+        </w:rPr>
+        <w:t xml:space="preserve">typedef struct _ACL </w:t>
+      </w:r>
+    </w:p>
+    <w:p>
+      <w:pPr>
+        <w:rPr>
+          <w:rFonts w:eastAsia="Times New Roman"/>
+          <w:lang w:val="en-US"/>
+        </w:rPr>
+      </w:pPr>
+      <w:r>
+        <w:rPr>
+          <w:rFonts w:eastAsia="Times New Roman"/>
+          <w:lang w:val="en-US"/>
+        </w:rPr>
+        <w:t>{</w:t>
+      </w:r>
+    </w:p>
+    <w:p>
+      <w:pPr>
+        <w:ind w:left="708"/>
+        <w:rPr>
+          <w:rFonts w:eastAsia="Times New Roman"/>
+          <w:lang w:val="en-US"/>
+        </w:rPr>
+      </w:pPr>
+      <w:r>
+        <w:rPr>
+          <w:rFonts w:eastAsia="Times New Roman"/>
+          <w:lang w:val="en-US"/>
+        </w:rPr>
+        <w:t xml:space="preserve">BYTE </w:t>
+      </w:r>
+      <w:proofErr w:type="spellStart"/>
+      <w:r>
+        <w:rPr>
+          <w:rFonts w:eastAsia="Times New Roman"/>
+          <w:lang w:val="en-US"/>
+        </w:rPr>
+        <w:t>AclRevision</w:t>
+      </w:r>
+      <w:proofErr w:type="spellEnd"/>
+      <w:r>
+        <w:rPr>
+          <w:rFonts w:eastAsia="Times New Roman"/>
+          <w:lang w:val="en-US"/>
+        </w:rPr>
+        <w:t>;</w:t>
+      </w:r>
+    </w:p>
+    <w:p>
+      <w:pPr>
+        <w:ind w:left="708"/>
+        <w:rPr>
+          <w:rFonts w:eastAsia="Times New Roman"/>
+          <w:lang w:val="en-US"/>
+        </w:rPr>
+      </w:pPr>
+      <w:r>
+        <w:rPr>
+          <w:rFonts w:eastAsia="Times New Roman"/>
+          <w:lang w:val="en-US"/>
+        </w:rPr>
+        <w:t>BYTE Sbz1;</w:t>
+      </w:r>
+    </w:p>
+    <w:p>
+      <w:pPr>
+        <w:ind w:left="708"/>
+        <w:rPr>
+          <w:rFonts w:eastAsia="Times New Roman"/>
+          <w:lang w:val="en-US"/>
+        </w:rPr>
+      </w:pPr>
+      <w:r>
+        <w:rPr>
+          <w:rFonts w:eastAsia="Times New Roman"/>
+          <w:lang w:val="en-US"/>
+        </w:rPr>
+        <w:t xml:space="preserve">WORD </w:t>
+      </w:r>
+      <w:proofErr w:type="spellStart"/>
+      <w:r>
+        <w:rPr>
+          <w:rFonts w:eastAsia="Times New Roman"/>
+          <w:lang w:val="en-US"/>
+        </w:rPr>
+        <w:t>AclSize</w:t>
+      </w:r>
+      <w:proofErr w:type="spellEnd"/>
+      <w:r>
+        <w:rPr>
+          <w:rFonts w:eastAsia="Times New Roman"/>
+          <w:lang w:val="en-US"/>
+        </w:rPr>
+        <w:t>;</w:t>
+      </w:r>
+    </w:p>
+    <w:p>
+      <w:pPr>
+        <w:ind w:left="708"/>
+        <w:rPr>
+          <w:rFonts w:eastAsia="Times New Roman"/>
+          <w:lang w:val="en-US"/>
+        </w:rPr>
+      </w:pPr>
+      <w:r>
+        <w:rPr>
+          <w:rFonts w:eastAsia="Times New Roman"/>
+          <w:lang w:val="en-US"/>
+        </w:rPr>
+        <w:t xml:space="preserve">WORD </w:t>
+      </w:r>
+      <w:proofErr w:type="spellStart"/>
+      <w:r>
+        <w:rPr>
+          <w:rFonts w:eastAsia="Times New Roman"/>
+          <w:lang w:val="en-US"/>
+        </w:rPr>
+        <w:t>AceCount</w:t>
+      </w:r>
+      <w:proofErr w:type="spellEnd"/>
+      <w:r>
+        <w:rPr>
+          <w:rFonts w:eastAsia="Times New Roman"/>
+          <w:lang w:val="en-US"/>
+        </w:rPr>
+        <w:t>;</w:t>
+      </w:r>
+    </w:p>
+    <w:p>
+      <w:pPr>
+        <w:ind w:left="708"/>
+        <w:rPr>
+          <w:rFonts w:eastAsia="Times New Roman"/>
+          <w:lang w:val="en-US"/>
+        </w:rPr>
+      </w:pPr>
+      <w:r>
+        <w:rPr>
+          <w:rFonts w:eastAsia="Times New Roman"/>
+          <w:lang w:val="en-US"/>
         </w:rPr>
         <w:lastRenderedPageBreak/>
-        <w:t>typedef</w:t>
-      </w:r>
-      <w:r>
+        <w:t>WORD Sbz2;</w:t>
+      </w:r>
+    </w:p>
+    <w:p>
+      <w:pPr>
         <w:rPr>
           <w:rFonts w:eastAsia="Times New Roman"/>
-        </w:rPr>
+          <w:lang w:val="en-US"/>
+        </w:rPr>
+      </w:pPr>
+      <w:r>
+        <w:rPr>
+          <w:rFonts w:eastAsia="Times New Roman"/>
+          <w:lang w:val="en-US"/>
+        </w:rPr>
+        <w:t>} ACL;</w:t>
+      </w:r>
+    </w:p>
+    <w:p>
+      <w:pPr>
+        <w:rPr>
+          <w:lang w:val="en-US"/>
+        </w:rPr>
+      </w:pPr>
+    </w:p>
+    <w:p>
+      <w:pPr>
+        <w:rPr>
+          <w:rFonts w:eastAsia="Times New Roman"/>
+        </w:rPr>
+      </w:pPr>
+      <w:r>
+        <w:rPr>
+          <w:rFonts w:eastAsia="Times New Roman"/>
+        </w:rPr>
+        <w:t>Список управления доступом на уровне пользователей (DACL) определяет доверенные лица, которым разрешен или запрещен доступ к защищаемому объекту. Когда процесс пытается получить доступ к защищаемому объекту, система проверяет ACE в списке DACL объекта, чтобы определить, следует ли предоставить доступ к нему. Если у объекта нет DACL, система предоставляет полный доступ для всех. Если DACL объекта не имеет записей ACE, система отклоняет все попытки доступа к объекту, так как список DACL не разрешает права доступа. Система проверяет ACE по порядку, пока не обнаружит один или несколько записей ACE, которые разрешают все запрошенные права доступа, или пока не будут отклонены все запрошенные права доступа.</w:t>
+      </w:r>
+    </w:p>
+    <w:p>
+      <w:pPr>
+        <w:rPr>
+          <w:rFonts w:eastAsia="Times New Roman"/>
+        </w:rPr>
+      </w:pPr>
+      <w:r>
+        <w:rPr>
+          <w:rFonts w:eastAsia="Times New Roman"/>
+        </w:rPr>
+        <w:t>Системный список управления доступом (SACL) позволяет администраторам регистрировать попытки доступа к защищенному объекту.</w:t>
+      </w:r>
+    </w:p>
+    <w:p>
+      <w:pPr>
+        <w:rPr>
+          <w:rFonts w:eastAsia="Times New Roman"/>
+        </w:rPr>
+      </w:pPr>
+      <w:r>
+        <w:rPr>
+          <w:rFonts w:eastAsia="Times New Roman"/>
+        </w:rPr>
+        <w:t>Каждый элемент ACE указывает типы попыток доступа с помощью указанного доверенного лица, которое приводит к тому, что система создает запись в журнале событий безопасности. Элемент управления доступом в списке SACL может создавать записи аудита при неудачной попытке доступа, при успешном или в обоих случаях.</w:t>
+      </w:r>
+    </w:p>
+    <w:p>
+      <w:pPr>
+        <w:rPr>
+          <w:rFonts w:eastAsia="Times New Roman"/>
+        </w:rPr>
+      </w:pPr>
+    </w:p>
+    <w:p>
+      <w:pPr>
+        <w:pStyle w:val="a4"/>
+      </w:pPr>
+      <w:r>
+        <w:t>Что такое наследование прав доступа?</w:t>
+      </w:r>
+    </w:p>
+    <w:p>
+      <w:r>
+        <w:t>Наследование прав доступа в операционной системе Windows позволяет устанавливать и контролировать права доступа для файлов и папок на разных уровнях иерархии. Это позволяет обеспечить безопасность данных и контроль доступа различных пользователей или групп к определенным ресурсам.</w:t>
+      </w:r>
+    </w:p>
+    <w:p>
+      <w:r>
+        <w:t>Когда новый объект создается внутри существующей папки, он автоматически наследует права доступа от родительской папки. Это означает, что объект получает те же права доступа, что и родительская папка.</w:t>
+      </w:r>
+    </w:p>
+    <w:p/>
+    <w:p>
+      <w:pPr>
+        <w:pStyle w:val="a4"/>
+      </w:pPr>
+      <w:r>
+        <w:lastRenderedPageBreak/>
+        <w:t xml:space="preserve">Для чего используется </w:t>
+      </w:r>
+      <w:r>
+        <w:rPr>
+          <w:lang w:val="en-US"/>
+        </w:rPr>
+        <w:t>well</w:t>
+      </w:r>
+      <w:r>
+        <w:t>-</w:t>
+      </w:r>
+      <w:r>
+        <w:rPr>
+          <w:lang w:val="en-US"/>
+        </w:rPr>
+        <w:t>known</w:t>
+      </w:r>
+      <w:r>
         <w:t xml:space="preserve"> </w:t>
       </w:r>
       <w:r>
         <w:rPr>
+          <w:lang w:val="en-US"/>
+        </w:rPr>
+        <w:t>SID</w:t>
+      </w:r>
+      <w:r>
+        <w:t>?</w:t>
+      </w:r>
+    </w:p>
+    <w:p>
+      <w:pPr>
+        <w:rPr>
           <w:rFonts w:eastAsia="Times New Roman"/>
         </w:rPr>
-        <w:t>struct</w:t>
-      </w:r>
+      </w:pPr>
       <w:r>
         <w:rPr>
           <w:rFonts w:eastAsia="Times New Roman"/>
         </w:rPr>
-        <w:t xml:space="preserve"> _</w:t>
+        <w:t>Well-known SIDs используются для идентификации общих групп и общих пользователей. Например, существуют</w:t>
       </w:r>
       <w:r>
         <w:rPr>
           <w:rFonts w:eastAsia="Times New Roman"/>
-        </w:rPr>
-        <w:t>ACL</w:t>
+          <w:lang w:val="en-US"/>
+        </w:rPr>
+        <w:t xml:space="preserve"> </w:t>
       </w:r>
       <w:r>
         <w:rPr>
           <w:rFonts w:eastAsia="Times New Roman"/>
         </w:rPr>
+        <w:t>идентификации следующих общих групп и пользователей:</w:t>
+      </w:r>
+    </w:p>
+    <w:p>
+      <w:pPr>
+        <w:pStyle w:val="a1"/>
+        <w:rPr>
+          <w:rFonts w:eastAsia="Times New Roman"/>
+        </w:rPr>
+      </w:pPr>
+      <w:r>
+        <w:rPr>
+          <w:rFonts w:eastAsia="Times New Roman"/>
+        </w:rPr>
+        <w:t>«Каждый пользователь» или «Мир» - группа, в которую входят все пользователи.</w:t>
+      </w:r>
+    </w:p>
+    <w:p>
+      <w:pPr>
+        <w:pStyle w:val="a1"/>
+        <w:rPr>
+          <w:rFonts w:eastAsia="Times New Roman"/>
+        </w:rPr>
+      </w:pPr>
+      <w:r>
+        <w:rPr>
+          <w:rFonts w:eastAsia="Times New Roman"/>
+        </w:rPr>
+        <w:t>CREATOR_OWNER, - пользователь, который используется в качестве владельца в наследуемой записи ACE (Когда запись ACE наследуется, система заменяет CREATOR_OWNER SID на SID создателя объекта)</w:t>
+      </w:r>
+    </w:p>
+    <w:p>
+      <w:pPr>
+        <w:pStyle w:val="a1"/>
+        <w:rPr>
+          <w:rFonts w:eastAsia="Times New Roman"/>
+        </w:rPr>
+      </w:pPr>
+      <w:r>
+        <w:rPr>
+          <w:rFonts w:eastAsia="Times New Roman"/>
+        </w:rPr>
+        <w:t>Группа «Администраторы» для встроенного домена на локальном</w:t>
+      </w:r>
+    </w:p>
+    <w:p>
+      <w:pPr>
+        <w:rPr>
+          <w:rFonts w:eastAsia="Times New Roman"/>
+        </w:rPr>
+      </w:pPr>
+      <w:r>
+        <w:rPr>
+          <w:rFonts w:eastAsia="Times New Roman"/>
+        </w:rPr>
+        <w:t>компьютере.</w:t>
+      </w:r>
+    </w:p>
+    <w:p>
+      <w:pPr>
+        <w:rPr>
+          <w:lang w:val="en-US"/>
+        </w:rPr>
+      </w:pPr>
+    </w:p>
+    <w:p>
+      <w:pPr>
+        <w:pStyle w:val="a4"/>
+      </w:pPr>
+      <w:r>
+        <w:t xml:space="preserve">Как выглядит схема шифрования с использованием сеансового ключа? </w:t>
+      </w:r>
+    </w:p>
+    <w:p>
+      <w:r>
+        <w:t xml:space="preserve">В математическом примере обе стороны публично договариваются о числах </w:t>
+      </w:r>
+      <w:r>
+        <w:rPr>
+          <w:lang w:val="en-US"/>
+        </w:rPr>
+        <w:t>p</w:t>
+      </w:r>
+      <w:r>
+        <w:t xml:space="preserve">, </w:t>
+      </w:r>
+      <w:r>
+        <w:rPr>
+          <w:lang w:val="en-US"/>
+        </w:rPr>
+        <w:t>q</w:t>
+      </w:r>
+      <w:r>
+        <w:t xml:space="preserve"> (</w:t>
+      </w:r>
+      <w:r>
+        <w:t>зачастую достаточно большие простые числа). Затем схема получения общего числа (сеансового ключа) выглядит так:</w:t>
+      </w:r>
+    </w:p>
+    <w:p>
+      <w:pPr>
+        <w:pStyle w:val="a4"/>
+        <w:numPr>
+          <w:ilvl w:val="0"/>
+          <w:numId w:val="27"/>
+        </w:numPr>
+      </w:pPr>
+      <w:r>
+        <w:t xml:space="preserve">Обе стороны выбирают свои закрытые числа </w:t>
+      </w:r>
+      <w:r>
+        <w:rPr>
+          <w:lang w:val="en-US"/>
+        </w:rPr>
+        <w:t>a</w:t>
+      </w:r>
+      <w:r>
+        <w:t xml:space="preserve">, </w:t>
+      </w:r>
+      <w:r>
+        <w:rPr>
+          <w:lang w:val="en-US"/>
+        </w:rPr>
+        <w:t>b</w:t>
+      </w:r>
+      <w:r>
+        <w:t xml:space="preserve">, </w:t>
+      </w:r>
+      <w:r>
+        <w:t>которые остаются секретными</w:t>
+      </w:r>
+    </w:p>
+    <w:p>
+      <w:pPr>
+        <w:pStyle w:val="a4"/>
+        <w:numPr>
+          <w:ilvl w:val="0"/>
+          <w:numId w:val="27"/>
+        </w:numPr>
+      </w:pPr>
+      <w:r>
+        <w:t xml:space="preserve">Затем стороны выполняют следующие действия: </w:t>
+      </w:r>
+      <w:r>
+        <w:rPr>
+          <w:lang w:val="en-US"/>
+        </w:rPr>
+        <w:t>A</w:t>
+      </w:r>
+      <w:r>
+        <w:t xml:space="preserve"> = </w:t>
+      </w:r>
+      <w:r>
+        <w:rPr>
+          <w:lang w:val="en-US"/>
+        </w:rPr>
+        <w:t>p</w:t>
+      </w:r>
+      <w:r>
+        <w:rPr>
+          <w:vertAlign w:val="superscript"/>
+          <w:lang w:val="en-US"/>
+        </w:rPr>
+        <w:t>a</w:t>
+      </w:r>
+      <w:r>
         <w:t xml:space="preserve"> </w:t>
       </w:r>
-    </w:p>
-    <w:p>
-      <w:pPr>
+      <w:r>
+        <w:rPr>
+          <w:lang w:val="en-US"/>
+        </w:rPr>
+        <w:t>mod</w:t>
+      </w:r>
+      <w:r>
+        <w:t xml:space="preserve"> </w:t>
+      </w:r>
+      <w:r>
+        <w:rPr>
+          <w:lang w:val="en-US"/>
+        </w:rPr>
+        <w:t>q</w:t>
+      </w:r>
+      <w:r>
+        <w:t xml:space="preserve">; </w:t>
+      </w:r>
+      <w:r>
+        <w:rPr>
+          <w:lang w:val="en-US"/>
+        </w:rPr>
+        <w:t>B</w:t>
+      </w:r>
+      <w:r>
+        <w:t xml:space="preserve"> = </w:t>
+      </w:r>
+      <w:r>
+        <w:rPr>
+          <w:lang w:val="en-US"/>
+        </w:rPr>
+        <w:t>p</w:t>
+      </w:r>
+      <w:r>
+        <w:rPr>
+          <w:vertAlign w:val="superscript"/>
+          <w:lang w:val="en-US"/>
+        </w:rPr>
+        <w:t>b</w:t>
+      </w:r>
+      <w:r>
+        <w:t xml:space="preserve"> </w:t>
+      </w:r>
+      <w:r>
+        <w:rPr>
+          <w:lang w:val="en-US"/>
+        </w:rPr>
+        <w:t>mod</w:t>
+      </w:r>
+      <w:r>
+        <w:t xml:space="preserve"> </w:t>
+      </w:r>
+      <w:r>
+        <w:rPr>
+          <w:lang w:val="en-US"/>
+        </w:rPr>
+        <w:t>q</w:t>
+      </w:r>
+      <w:r>
+        <w:t>;</w:t>
+      </w:r>
+    </w:p>
+    <w:p>
+      <w:pPr>
+        <w:pStyle w:val="a4"/>
+        <w:numPr>
+          <w:ilvl w:val="0"/>
+          <w:numId w:val="27"/>
+        </w:numPr>
+      </w:pPr>
+      <w:r>
+        <w:t xml:space="preserve">Стороны публично обмениваются числами </w:t>
+      </w:r>
+      <w:r>
+        <w:rPr>
+          <w:lang w:val="en-US"/>
+        </w:rPr>
+        <w:t>A</w:t>
+      </w:r>
+      <w:r>
+        <w:t xml:space="preserve">, </w:t>
+      </w:r>
+      <w:r>
+        <w:rPr>
+          <w:lang w:val="en-US"/>
+        </w:rPr>
+        <w:t>B</w:t>
+      </w:r>
+    </w:p>
+    <w:p>
+      <w:pPr>
+        <w:pStyle w:val="a4"/>
+        <w:numPr>
+          <w:ilvl w:val="0"/>
+          <w:numId w:val="27"/>
+        </w:numPr>
+      </w:pPr>
+      <w:r>
+        <w:t xml:space="preserve">Затем стороны возводят полученные числа в степень своего закрытого числа: </w:t>
+      </w:r>
+      <w:r>
+        <w:rPr>
+          <w:lang w:val="en-US"/>
+        </w:rPr>
+        <w:t>K</w:t>
+      </w:r>
+      <w:r>
+        <w:rPr>
+          <w:vertAlign w:val="subscript"/>
+        </w:rPr>
+        <w:t>1</w:t>
+      </w:r>
+      <w:r>
+        <w:t xml:space="preserve"> = </w:t>
+      </w:r>
+      <w:r>
+        <w:rPr>
+          <w:lang w:val="en-US"/>
+        </w:rPr>
+        <w:t>A</w:t>
+      </w:r>
+      <w:r>
+        <w:rPr>
+          <w:vertAlign w:val="superscript"/>
+          <w:lang w:val="en-US"/>
+        </w:rPr>
+        <w:t>b</w:t>
+      </w:r>
+      <w:r>
+        <w:t xml:space="preserve"> </w:t>
+      </w:r>
+      <w:r>
+        <w:rPr>
+          <w:lang w:val="en-US"/>
+        </w:rPr>
+        <w:t>mod</w:t>
+      </w:r>
+      <w:r>
+        <w:t xml:space="preserve"> </w:t>
+      </w:r>
+      <w:r>
+        <w:rPr>
+          <w:lang w:val="en-US"/>
+        </w:rPr>
+        <w:t>q</w:t>
+      </w:r>
+      <w:r>
+        <w:t xml:space="preserve">; </w:t>
+      </w:r>
+      <w:r>
+        <w:rPr>
+          <w:lang w:val="en-US"/>
+        </w:rPr>
+        <w:t>K</w:t>
+      </w:r>
+      <w:r>
+        <w:rPr>
+          <w:vertAlign w:val="subscript"/>
+        </w:rPr>
+        <w:t>2</w:t>
+      </w:r>
+      <w:r>
+        <w:t xml:space="preserve"> = </w:t>
+      </w:r>
+      <w:r>
+        <w:rPr>
+          <w:lang w:val="en-US"/>
+        </w:rPr>
+        <w:t>B</w:t>
+      </w:r>
+      <w:r>
+        <w:rPr>
+          <w:vertAlign w:val="superscript"/>
+          <w:lang w:val="en-US"/>
+        </w:rPr>
+        <w:t>a</w:t>
+      </w:r>
+      <w:r>
+        <w:t xml:space="preserve"> </w:t>
+      </w:r>
+      <w:r>
+        <w:rPr>
+          <w:lang w:val="en-US"/>
+        </w:rPr>
+        <w:t>mod</w:t>
+      </w:r>
+      <w:r>
+        <w:t xml:space="preserve"> </w:t>
+      </w:r>
+      <w:r>
+        <w:rPr>
+          <w:lang w:val="en-US"/>
+        </w:rPr>
+        <w:t>q</w:t>
+      </w:r>
+      <w:r>
+        <w:t xml:space="preserve">; </w:t>
+      </w:r>
+      <w:r>
+        <w:t xml:space="preserve">Тем самым стороны получают общее число, которое не было передано публично, т. к. </w:t>
+      </w:r>
+      <w:r>
+        <w:rPr>
+          <w:lang w:val="en-US"/>
+        </w:rPr>
+        <w:t>K</w:t>
+      </w:r>
+      <w:r>
+        <w:rPr>
+          <w:vertAlign w:val="subscript"/>
+        </w:rPr>
+        <w:t>1</w:t>
+      </w:r>
+      <w:r>
+        <w:t xml:space="preserve"> = </w:t>
+      </w:r>
+      <w:r>
+        <w:rPr>
+          <w:lang w:val="en-US"/>
+        </w:rPr>
+        <w:t>K</w:t>
+      </w:r>
+      <w:r>
+        <w:rPr>
+          <w:vertAlign w:val="subscript"/>
+        </w:rPr>
+        <w:t>2</w:t>
+      </w:r>
+    </w:p>
+    <w:p>
+      <w:r>
+        <w:t xml:space="preserve">Генерация и передача сеансового ключа происходит во время каждого соединения клиента и сервера. Затем стороны могут использовать симметричное шифрование (например с использованием </w:t>
+      </w:r>
+      <w:proofErr w:type="spellStart"/>
+      <w:r>
+        <w:rPr>
+          <w:lang w:val="en-US"/>
+        </w:rPr>
+        <w:t>xor</w:t>
+      </w:r>
+      <w:proofErr w:type="spellEnd"/>
+      <w:r>
+        <w:t xml:space="preserve"> </w:t>
+      </w:r>
+      <w:r>
+        <w:t xml:space="preserve">с байтами данных и байтами ключа). Одна из особенностей сеансового ключа состоит в том, что он </w:t>
+      </w:r>
+      <w:r>
+        <w:lastRenderedPageBreak/>
+        <w:t>используется в шифровании в течение одной сессии, а каждые последующие сессии будут шифроваться уже с другим ключом, сгенерированным в начале.</w:t>
+      </w:r>
+    </w:p>
+    <w:p/>
+    <w:p>
+      <w:pPr>
+        <w:pStyle w:val="a4"/>
+      </w:pPr>
+      <w:r>
+        <w:t>В чем преимущества использования сеансового ключа?</w:t>
+      </w:r>
+    </w:p>
+    <w:p>
+      <w:r>
+        <w:t>Сеансовый ключ позволяет защититься от повторного использования злоумышленником перехваченных потоков данных, а также конкретный сеансовый ключ будет актуальным непродолжительное количество времени.</w:t>
+      </w:r>
+    </w:p>
+    <w:p>
+      <w:pPr>
+        <w:pStyle w:val="a4"/>
+        <w:numPr>
+          <w:ilvl w:val="0"/>
+          <w:numId w:val="0"/>
+        </w:numPr>
+        <w:ind w:left="851"/>
+      </w:pPr>
+    </w:p>
+    <w:p/>
+    <w:p>
+      <w:pPr>
+        <w:pStyle w:val="a9"/>
+      </w:pPr>
+      <w:r>
+        <w:t>Вывод</w:t>
+      </w:r>
+    </w:p>
+    <w:p>
+      <w:r>
         <w:rPr>
           <w:rFonts w:eastAsia="Times New Roman"/>
         </w:rPr>
-      </w:pPr>
-      <w:r>
-        <w:rPr>
-          <w:rFonts w:eastAsia="Times New Roman"/>
-        </w:rPr>
-        <w:t>{</w:t>
-      </w:r>
-    </w:p>
-    <w:p>
-      <w:pPr>
-        <w:rPr>
-          <w:rFonts w:eastAsia="Times New Roman"/>
-        </w:rPr>
-      </w:pPr>
-      <w:r>
-        <w:rPr>
-          <w:rFonts w:eastAsia="Times New Roman"/>
-        </w:rPr>
-        <w:t>BYTE AclRevision;</w:t>
-      </w:r>
-    </w:p>
-    <w:p>
-      <w:pPr>
-        <w:rPr>
-          <w:rFonts w:eastAsia="Times New Roman"/>
-        </w:rPr>
-      </w:pPr>
-      <w:r>
-        <w:rPr>
-          <w:rFonts w:eastAsia="Times New Roman"/>
-        </w:rPr>
-        <w:t>BYTE Sbz1;</w:t>
-      </w:r>
-    </w:p>
-    <w:p>
-      <w:pPr>
-        <w:rPr>
-          <w:rFonts w:eastAsia="Times New Roman"/>
-        </w:rPr>
-      </w:pPr>
-      <w:r>
-        <w:rPr>
-          <w:rFonts w:eastAsia="Times New Roman"/>
-        </w:rPr>
-        <w:t xml:space="preserve">WORD </w:t>
-      </w:r>
-      <w:proofErr w:type="spellStart"/>
-      <w:r>
-        <w:rPr>
-          <w:rFonts w:eastAsia="Times New Roman"/>
-        </w:rPr>
-        <w:t>AclSize</w:t>
-      </w:r>
-      <w:proofErr w:type="spellEnd"/>
-      <w:r>
-        <w:rPr>
-          <w:rFonts w:eastAsia="Times New Roman"/>
-        </w:rPr>
-        <w:t>;</w:t>
-      </w:r>
-    </w:p>
-    <w:p>
-      <w:pPr>
-        <w:rPr>
-          <w:rFonts w:eastAsia="Times New Roman"/>
-        </w:rPr>
-      </w:pPr>
-      <w:r>
-        <w:rPr>
-          <w:rFonts w:eastAsia="Times New Roman"/>
-        </w:rPr>
-        <w:t xml:space="preserve">WORD </w:t>
-      </w:r>
-      <w:proofErr w:type="spellStart"/>
-      <w:r>
-        <w:rPr>
-          <w:rFonts w:eastAsia="Times New Roman"/>
-        </w:rPr>
-        <w:t>AceCount</w:t>
-      </w:r>
-      <w:proofErr w:type="spellEnd"/>
-      <w:r>
-        <w:rPr>
-          <w:rFonts w:eastAsia="Times New Roman"/>
-        </w:rPr>
-        <w:t>;</w:t>
-      </w:r>
-    </w:p>
-    <w:p>
-      <w:pPr>
-        <w:rPr>
-          <w:rFonts w:eastAsia="Times New Roman"/>
-        </w:rPr>
-      </w:pPr>
-      <w:r>
-        <w:rPr>
-          <w:rFonts w:eastAsia="Times New Roman"/>
-        </w:rPr>
-        <w:t>WORD Sbz2;</w:t>
-      </w:r>
-    </w:p>
-    <w:p>
-      <w:pPr>
-        <w:rPr>
-          <w:rFonts w:eastAsia="Times New Roman"/>
-        </w:rPr>
-      </w:pPr>
-      <w:r>
-        <w:rPr>
-          <w:rFonts w:eastAsia="Times New Roman"/>
-        </w:rPr>
-        <w:t>} ACL;</w:t>
-      </w:r>
-    </w:p>
-    <w:p>
-      <w:pPr>
-        <w:rPr>
-          <w:lang w:val="en-US"/>
-        </w:rPr>
-      </w:pPr>
-    </w:p>
-    <w:p>
-      <w:pPr>
-        <w:spacing w:line="240" w:lineRule="auto"/>
-        <w:ind w:firstLine="0"/>
-        <w:rPr>
-          <w:lang w:val="en-US"/>
-        </w:rPr>
-      </w:pPr>
-      <w:r>
-        <w:rPr>
-          <w:lang w:val="en-US"/>
-        </w:rPr>
+        <w:t>В ходе данной лабораторной работы были получены навыки организации параллельной обработки большого количества клиентских соединений при помощи механизма портов завершения Win32. Получены навыки реализации шифрования передаваемых данных при помощи средств CryptoAPI. Получены навыки извлечения информации о системе. Была разработана распределенная система сбора информации о компьютере, состоящая из сервера и клиента, взаимодействующих через сокеты.</w:t>
+      </w:r>
+    </w:p>
+    <w:p>
+      <w:r>
         <w:br w:type="page"/>
       </w:r>
     </w:p>
@@ -10425,15 +11078,7 @@
       </w:r>
       <w:proofErr w:type="spellEnd"/>
       <w:r>
-        <w:t>, &amp;</w:t>
-      </w:r>
-      <w:proofErr w:type="spellStart"/>
-      <w:r>
-        <w:t>sidType</w:t>
-      </w:r>
-      <w:proofErr w:type="spellEnd"/>
-      <w:r>
-        <w:t>))</w:t>
+        <w:t>, &amp;sidType))</w:t>
       </w:r>
     </w:p>
     <w:p>
@@ -11797,15 +12442,7 @@
       </w:r>
       <w:proofErr w:type="spellEnd"/>
       <w:r>
-        <w:t xml:space="preserve"> </w:t>
-      </w:r>
-      <w:proofErr w:type="spellStart"/>
-      <w:r>
-        <w:t>os</w:t>
-      </w:r>
-      <w:proofErr w:type="spellEnd"/>
-      <w:r>
-        <w:t xml:space="preserve"> = </w:t>
+        <w:t xml:space="preserve"> os = </w:t>
       </w:r>
       <w:proofErr w:type="spellStart"/>
       <w:proofErr w:type="gramStart"/>
@@ -18924,15 +19561,7 @@
       </w:r>
       <w:proofErr w:type="spellEnd"/>
       <w:r>
-        <w:t xml:space="preserve"> </w:t>
-      </w:r>
-      <w:proofErr w:type="spellStart"/>
-      <w:r>
-        <w:t>systemStart</w:t>
-      </w:r>
-      <w:proofErr w:type="spellEnd"/>
-      <w:r>
-        <w:t xml:space="preserve"> = </w:t>
+        <w:t xml:space="preserve"> systemStart = </w:t>
       </w:r>
       <w:proofErr w:type="spellStart"/>
       <w:proofErr w:type="gramStart"/>
@@ -24380,14 +25009,9 @@
       <w:r>
         <w:t xml:space="preserve"> </w:t>
       </w:r>
-      <w:proofErr w:type="spellStart"/>
-      <w:proofErr w:type="gramStart"/>
-      <w:r>
-        <w:t>clientAddress</w:t>
-      </w:r>
-      <w:proofErr w:type="spellEnd"/>
-      <w:r>
-        <w:t>{</w:t>
+      <w:proofErr w:type="gramStart"/>
+      <w:r>
+        <w:t>clientAddress{</w:t>
       </w:r>
       <w:proofErr w:type="gramEnd"/>
       <w:r>
@@ -30803,15 +31427,7 @@
       </w:r>
       <w:proofErr w:type="gramEnd"/>
       <w:r>
-        <w:t xml:space="preserve">), size, </w:t>
-      </w:r>
-      <w:proofErr w:type="spellStart"/>
-      <w:r>
-        <w:t>nullptr</w:t>
-      </w:r>
-      <w:proofErr w:type="spellEnd"/>
-      <w:r>
-        <w:t>,</w:t>
+        <w:t>), size, nullptr,</w:t>
       </w:r>
     </w:p>
     <w:p>
@@ -42713,12 +43329,12 @@
       </w:pPr>
     </w:p>
     <w:sectPr>
-      <w:headerReference w:type="even" r:id="rId14"/>
-      <w:headerReference w:type="default" r:id="rId15"/>
-      <w:footerReference w:type="even" r:id="rId16"/>
-      <w:footerReference w:type="default" r:id="rId17"/>
-      <w:headerReference w:type="first" r:id="rId18"/>
-      <w:footerReference w:type="first" r:id="rId19"/>
+      <w:headerReference w:type="even" r:id="rId15"/>
+      <w:headerReference w:type="default" r:id="rId16"/>
+      <w:footerReference w:type="even" r:id="rId17"/>
+      <w:footerReference w:type="default" r:id="rId18"/>
+      <w:headerReference w:type="first" r:id="rId19"/>
+      <w:footerReference w:type="first" r:id="rId20"/>
       <w:pgSz w:w="11906" w:h="16838"/>
       <w:pgMar w:top="1134" w:right="850" w:bottom="1134" w:left="1134" w:header="708" w:footer="708" w:gutter="0"/>
       <w:cols w:space="708"/>
@@ -44816,8 +45432,8 @@
   <w:abstractNum w:abstractNumId="20" w15:restartNumberingAfterBreak="0">
     <w:nsid w:val="5D123824"/>
     <w:multiLevelType w:val="hybridMultilevel"/>
-    <w:tmpl w:val="D9EAA19A"/>
-    <w:lvl w:ilvl="0" w:tplc="25F0B318">
+    <w:tmpl w:val="693C9558"/>
+    <w:lvl w:ilvl="0" w:tplc="FD66FBD8">
       <w:start w:val="1"/>
       <w:numFmt w:val="decimal"/>
       <w:pStyle w:val="a4"/>
@@ -45603,6 +46219,12 @@
   </w:num>
   <w:num w:numId="26" w16cid:durableId="1095394114">
     <w:abstractNumId w:val="15"/>
+  </w:num>
+  <w:num w:numId="27" w16cid:durableId="1668901682">
+    <w:abstractNumId w:val="20"/>
+    <w:lvlOverride w:ilvl="0">
+      <w:startOverride w:val="1"/>
+    </w:lvlOverride>
   </w:num>
   <w:numIdMacAtCleanup w:val="12"/>
 </w:numbering>

</xml_diff>